<commit_message>
docs: agregar capturas del video al manual de usuario
</commit_message>
<xml_diff>
--- a/documentacion/05_Manual_de_Usuario.docx
+++ b/documentacion/05_Manual_de_Usuario.docx
@@ -199,6 +199,58 @@
     </w:p>
     <w:p>
       <w:pPr>
+        <w:jc w:val="center"/>
+      </w:pPr>
+      <w:r>
+        <w:drawing>
+          <wp:inline xmlns:a="http://schemas.openxmlformats.org/drawingml/2006/main" xmlns:pic="http://schemas.openxmlformats.org/drawingml/2006/picture">
+            <wp:extent cx="2743200" cy="3787222"/>
+            <wp:docPr id="1" name="Picture 1"/>
+            <wp:cNvGraphicFramePr>
+              <a:graphicFrameLocks noChangeAspect="1"/>
+            </wp:cNvGraphicFramePr>
+            <a:graphic>
+              <a:graphicData uri="http://schemas.openxmlformats.org/drawingml/2006/picture">
+                <pic:pic>
+                  <pic:nvPicPr>
+                    <pic:cNvPr id="0" name="sistema_completo.jpg"/>
+                    <pic:cNvPicPr/>
+                  </pic:nvPicPr>
+                  <pic:blipFill>
+                    <a:blip r:embed="rId10"/>
+                    <a:stretch>
+                      <a:fillRect/>
+                    </a:stretch>
+                  </pic:blipFill>
+                  <pic:spPr>
+                    <a:xfrm>
+                      <a:off x="0" y="0"/>
+                      <a:ext cx="2743200" cy="3787222"/>
+                    </a:xfrm>
+                    <a:prstGeom prst="rect"/>
+                  </pic:spPr>
+                </pic:pic>
+              </a:graphicData>
+            </a:graphic>
+          </wp:inline>
+        </w:drawing>
+      </w:r>
+    </w:p>
+    <w:p>
+      <w:pPr>
+        <w:jc w:val="center"/>
+      </w:pPr>
+      <w:r>
+        <w:rPr>
+          <w:i/>
+          <w:color w:val="595959"/>
+          <w:sz w:val="18"/>
+        </w:rPr>
+        <w:t>Figura 1. El guante Glove-E y la aplicación móvil funcionando juntos.</w:t>
+      </w:r>
+    </w:p>
+    <w:p>
+      <w:pPr>
         <w:pStyle w:val="Heading1"/>
         <w:pageBreakBefore/>
       </w:pPr>
@@ -344,6 +396,58 @@
           <w:szCs w:val="22"/>
         </w:rPr>
         <w:t xml:space="preserve">alimenta el dispositivo.</w:t>
+      </w:r>
+    </w:p>
+    <w:p>
+      <w:pPr>
+        <w:jc w:val="center"/>
+      </w:pPr>
+      <w:r>
+        <w:drawing>
+          <wp:inline xmlns:a="http://schemas.openxmlformats.org/drawingml/2006/main" xmlns:pic="http://schemas.openxmlformats.org/drawingml/2006/picture">
+            <wp:extent cx="3840480" cy="3893738"/>
+            <wp:docPr id="2" name="Picture 2"/>
+            <wp:cNvGraphicFramePr>
+              <a:graphicFrameLocks noChangeAspect="1"/>
+            </wp:cNvGraphicFramePr>
+            <a:graphic>
+              <a:graphicData uri="http://schemas.openxmlformats.org/drawingml/2006/picture">
+                <pic:pic>
+                  <pic:nvPicPr>
+                    <pic:cNvPr id="0" name="guante_sensor.jpg"/>
+                    <pic:cNvPicPr/>
+                  </pic:nvPicPr>
+                  <pic:blipFill>
+                    <a:blip r:embed="rId11"/>
+                    <a:stretch>
+                      <a:fillRect/>
+                    </a:stretch>
+                  </pic:blipFill>
+                  <pic:spPr>
+                    <a:xfrm>
+                      <a:off x="0" y="0"/>
+                      <a:ext cx="3840480" cy="3893738"/>
+                    </a:xfrm>
+                    <a:prstGeom prst="rect"/>
+                  </pic:spPr>
+                </pic:pic>
+              </a:graphicData>
+            </a:graphic>
+          </wp:inline>
+        </w:drawing>
+      </w:r>
+    </w:p>
+    <w:p>
+      <w:pPr>
+        <w:jc w:val="center"/>
+      </w:pPr>
+      <w:r>
+        <w:rPr>
+          <w:i/>
+          <w:color w:val="595959"/>
+          <w:sz w:val="18"/>
+        </w:rPr>
+        <w:t>Figura 2. Guante colocado en la mano: sensor ultrasónico y cableado del prototipo.</w:t>
       </w:r>
     </w:p>
     <w:p>
@@ -1066,6 +1170,58 @@
     </w:p>
     <w:p>
       <w:pPr>
+        <w:jc w:val="center"/>
+      </w:pPr>
+      <w:r>
+        <w:drawing>
+          <wp:inline xmlns:a="http://schemas.openxmlformats.org/drawingml/2006/main" xmlns:pic="http://schemas.openxmlformats.org/drawingml/2006/picture">
+            <wp:extent cx="2651760" cy="3044613"/>
+            <wp:docPr id="3" name="Picture 3"/>
+            <wp:cNvGraphicFramePr>
+              <a:graphicFrameLocks noChangeAspect="1"/>
+            </wp:cNvGraphicFramePr>
+            <a:graphic>
+              <a:graphicData uri="http://schemas.openxmlformats.org/drawingml/2006/picture">
+                <pic:pic>
+                  <pic:nvPicPr>
+                    <pic:cNvPr id="0" name="config_inicial.jpg"/>
+                    <pic:cNvPicPr/>
+                  </pic:nvPicPr>
+                  <pic:blipFill>
+                    <a:blip r:embed="rId12"/>
+                    <a:stretch>
+                      <a:fillRect/>
+                    </a:stretch>
+                  </pic:blipFill>
+                  <pic:spPr>
+                    <a:xfrm>
+                      <a:off x="0" y="0"/>
+                      <a:ext cx="2651760" cy="3044613"/>
+                    </a:xfrm>
+                    <a:prstGeom prst="rect"/>
+                  </pic:spPr>
+                </pic:pic>
+              </a:graphicData>
+            </a:graphic>
+          </wp:inline>
+        </w:drawing>
+      </w:r>
+    </w:p>
+    <w:p>
+      <w:pPr>
+        <w:jc w:val="center"/>
+      </w:pPr>
+      <w:r>
+        <w:rPr>
+          <w:i/>
+          <w:color w:val="595959"/>
+          <w:sz w:val="18"/>
+        </w:rPr>
+        <w:t>Figura 3. Pantalla de bienvenida: nombre del usuario, contacto de emergencia y su teléfono.</w:t>
+      </w:r>
+    </w:p>
+    <w:p>
+      <w:pPr>
         <w:pStyle w:val="Heading1"/>
         <w:pageBreakBefore/>
       </w:pPr>
@@ -1137,10 +1293,114 @@
     </w:p>
     <w:p>
       <w:pPr>
+        <w:jc w:val="center"/>
+      </w:pPr>
+      <w:r>
+        <w:drawing>
+          <wp:inline xmlns:a="http://schemas.openxmlformats.org/drawingml/2006/main" xmlns:pic="http://schemas.openxmlformats.org/drawingml/2006/picture">
+            <wp:extent cx="2926080" cy="2981029"/>
+            <wp:docPr id="4" name="Picture 4"/>
+            <wp:cNvGraphicFramePr>
+              <a:graphicFrameLocks noChangeAspect="1"/>
+            </wp:cNvGraphicFramePr>
+            <a:graphic>
+              <a:graphicData uri="http://schemas.openxmlformats.org/drawingml/2006/picture">
+                <pic:pic>
+                  <pic:nvPicPr>
+                    <pic:cNvPr id="0" name="inicio_seguro.jpg"/>
+                    <pic:cNvPicPr/>
+                  </pic:nvPicPr>
+                  <pic:blipFill>
+                    <a:blip r:embed="rId13"/>
+                    <a:stretch>
+                      <a:fillRect/>
+                    </a:stretch>
+                  </pic:blipFill>
+                  <pic:spPr>
+                    <a:xfrm>
+                      <a:off x="0" y="0"/>
+                      <a:ext cx="2926080" cy="2981029"/>
+                    </a:xfrm>
+                    <a:prstGeom prst="rect"/>
+                  </pic:spPr>
+                </pic:pic>
+              </a:graphicData>
+            </a:graphic>
+          </wp:inline>
+        </w:drawing>
+      </w:r>
+    </w:p>
+    <w:p>
+      <w:pPr>
+        <w:jc w:val="center"/>
+      </w:pPr>
+      <w:r>
+        <w:rPr>
+          <w:i/>
+          <w:color w:val="595959"/>
+          <w:sz w:val="18"/>
+        </w:rPr>
+        <w:t>Figura 4. Pantalla de Inicio conectada al guante, estado “Seguro” (círculo verde).</w:t>
+      </w:r>
+    </w:p>
+    <w:p>
+      <w:pPr>
         <w:pStyle w:val="Heading2"/>
       </w:pPr>
       <w:r>
         <w:t xml:space="preserve">6.2 Indicador de distancia</w:t>
+      </w:r>
+    </w:p>
+    <w:p>
+      <w:pPr>
+        <w:jc w:val="center"/>
+      </w:pPr>
+      <w:r>
+        <w:drawing>
+          <wp:inline xmlns:a="http://schemas.openxmlformats.org/drawingml/2006/main" xmlns:pic="http://schemas.openxmlformats.org/drawingml/2006/picture">
+            <wp:extent cx="2926080" cy="3461841"/>
+            <wp:docPr id="5" name="Picture 5"/>
+            <wp:cNvGraphicFramePr>
+              <a:graphicFrameLocks noChangeAspect="1"/>
+            </wp:cNvGraphicFramePr>
+            <a:graphic>
+              <a:graphicData uri="http://schemas.openxmlformats.org/drawingml/2006/picture">
+                <pic:pic>
+                  <pic:nvPicPr>
+                    <pic:cNvPr id="0" name="inicio_advertencia.jpg"/>
+                    <pic:cNvPicPr/>
+                  </pic:nvPicPr>
+                  <pic:blipFill>
+                    <a:blip r:embed="rId14"/>
+                    <a:stretch>
+                      <a:fillRect/>
+                    </a:stretch>
+                  </pic:blipFill>
+                  <pic:spPr>
+                    <a:xfrm>
+                      <a:off x="0" y="0"/>
+                      <a:ext cx="2926080" cy="3461841"/>
+                    </a:xfrm>
+                    <a:prstGeom prst="rect"/>
+                  </pic:spPr>
+                </pic:pic>
+              </a:graphicData>
+            </a:graphic>
+          </wp:inline>
+        </w:drawing>
+      </w:r>
+    </w:p>
+    <w:p>
+      <w:pPr>
+        <w:jc w:val="center"/>
+      </w:pPr>
+      <w:r>
+        <w:rPr>
+          <w:i/>
+          <w:color w:val="595959"/>
+          <w:sz w:val="18"/>
+        </w:rPr>
+        <w:t>Figura 5. Estado “Advertencia” (círculo naranja) cuando hay un obstáculo cercano.</w:t>
       </w:r>
     </w:p>
     <w:tbl>

</xml_diff>